<commit_message>
nmv 15 10 2026
</commit_message>
<xml_diff>
--- a/TS-Kramam/TS-5.4/TS 5.4 Malayalam Krama Paatam Corrections.docx
+++ b/TS-Kramam/TS-5.4/TS 5.4 Malayalam Krama Paatam Corrections.docx
@@ -2989,6 +2989,518 @@
                 <w:lang w:val="en-IN" w:eastAsia="en-IN" w:bidi="ml-IN"/>
               </w:rPr>
               <w:t>ix |</w:t>
+            </w:r>
+          </w:p>
+        </w:tc>
+      </w:tr>
+      <w:tr>
+        <w:trPr>
+          <w:trHeight w:val="1680"/>
+        </w:trPr>
+        <w:tc>
+          <w:tcPr>
+            <w:tcW w:w="3907" w:type="dxa"/>
+          </w:tcPr>
+          <w:p>
+            <w:pPr>
+              <w:widowControl w:val="0"/>
+              <w:tabs>
+                <w:tab w:val="left" w:pos="993"/>
+              </w:tabs>
+              <w:autoSpaceDE w:val="0"/>
+              <w:autoSpaceDN w:val="0"/>
+              <w:adjustRightInd w:val="0"/>
+              <w:spacing w:before="0" w:line="240" w:lineRule="auto"/>
+              <w:ind w:right="297"/>
+              <w:rPr>
+                <w:rFonts w:cs="Arial"/>
+                <w:b/>
+                <w:color w:val="EE0000"/>
+                <w:sz w:val="28"/>
+                <w:szCs w:val="32"/>
+              </w:rPr>
+            </w:pPr>
+            <w:r>
+              <w:rPr>
+                <w:rFonts w:cs="Arial"/>
+                <w:b/>
+                <w:color w:val="EE0000"/>
+                <w:sz w:val="28"/>
+                <w:szCs w:val="32"/>
+              </w:rPr>
+              <w:t>T.S.5.4.11.1– Kramam</w:t>
+            </w:r>
+          </w:p>
+          <w:p>
+            <w:pPr>
+              <w:widowControl w:val="0"/>
+              <w:tabs>
+                <w:tab w:val="left" w:pos="993"/>
+              </w:tabs>
+              <w:autoSpaceDE w:val="0"/>
+              <w:autoSpaceDN w:val="0"/>
+              <w:adjustRightInd w:val="0"/>
+              <w:spacing w:before="0" w:line="240" w:lineRule="auto"/>
+              <w:ind w:right="297"/>
+              <w:rPr>
+                <w:rFonts w:cs="Arial"/>
+                <w:b/>
+                <w:color w:val="EE0000"/>
+                <w:szCs w:val="28"/>
+                <w:lang w:val="en-IN"/>
+              </w:rPr>
+            </w:pPr>
+            <w:r>
+              <w:rPr>
+                <w:rFonts w:cs="Arial"/>
+                <w:b/>
+                <w:color w:val="EE0000"/>
+                <w:sz w:val="28"/>
+                <w:szCs w:val="32"/>
+                <w:lang w:val="en-IN"/>
+              </w:rPr>
+              <w:t>Krama Vaakyam No.– 30</w:t>
+            </w:r>
+          </w:p>
+          <w:p>
+            <w:pPr>
+              <w:widowControl w:val="0"/>
+              <w:tabs>
+                <w:tab w:val="left" w:pos="993"/>
+              </w:tabs>
+              <w:autoSpaceDE w:val="0"/>
+              <w:autoSpaceDN w:val="0"/>
+              <w:adjustRightInd w:val="0"/>
+              <w:spacing w:before="0" w:line="240" w:lineRule="auto"/>
+              <w:ind w:right="297"/>
+              <w:rPr>
+                <w:rFonts w:cs="Arial"/>
+                <w:b/>
+                <w:color w:val="EE0000"/>
+                <w:sz w:val="28"/>
+                <w:szCs w:val="32"/>
+                <w:lang w:val="it-IT"/>
+              </w:rPr>
+            </w:pPr>
+            <w:r>
+              <w:rPr>
+                <w:rFonts w:cs="Arial"/>
+                <w:b/>
+                <w:color w:val="EE0000"/>
+                <w:sz w:val="28"/>
+                <w:szCs w:val="32"/>
+                <w:lang w:val="it-IT"/>
+              </w:rPr>
+              <w:t>Panchaati No</w:t>
+            </w:r>
+            <w:r>
+              <w:rPr>
+                <w:rFonts w:cs="Arial"/>
+                <w:b/>
+                <w:color w:val="EE0000"/>
+                <w:szCs w:val="32"/>
+                <w:lang w:val="it-IT"/>
+              </w:rPr>
+              <w:t xml:space="preserve">. - </w:t>
+            </w:r>
+            <w:r>
+              <w:rPr>
+                <w:rFonts w:cs="Arial"/>
+                <w:b/>
+                <w:color w:val="EE0000"/>
+                <w:sz w:val="28"/>
+                <w:szCs w:val="32"/>
+                <w:lang w:val="it-IT"/>
+              </w:rPr>
+              <w:t>52</w:t>
+            </w:r>
+          </w:p>
+        </w:tc>
+        <w:tc>
+          <w:tcPr>
+            <w:tcW w:w="5105" w:type="dxa"/>
+          </w:tcPr>
+          <w:p>
+            <w:pPr>
+              <w:widowControl w:val="0"/>
+              <w:autoSpaceDE w:val="0"/>
+              <w:autoSpaceDN w:val="0"/>
+              <w:adjustRightInd w:val="0"/>
+              <w:spacing w:before="0" w:line="240" w:lineRule="auto"/>
+              <w:rPr>
+                <w:rFonts w:ascii="BRH Malayalam Extra" w:eastAsia="Times New Roman" w:hAnsi="BRH Malayalam Extra" w:cs="BRH Malayalam Extra"/>
+                <w:color w:val="EE0000"/>
+                <w:sz w:val="40"/>
+                <w:szCs w:val="40"/>
+                <w:lang w:val="it-IT" w:eastAsia="en-IN" w:bidi="ml-IN"/>
+              </w:rPr>
+            </w:pPr>
+            <w:r>
+              <w:rPr>
+                <w:rFonts w:ascii="BRH Malayalam Extra" w:eastAsia="Times New Roman" w:hAnsi="BRH Malayalam Extra" w:cs="BRH Malayalam Extra"/>
+                <w:color w:val="EE0000"/>
+                <w:sz w:val="40"/>
+                <w:szCs w:val="40"/>
+                <w:lang w:val="it-IT" w:eastAsia="en-IN" w:bidi="ml-IN"/>
+              </w:rPr>
+              <w:t>K</w:t>
+            </w:r>
+            <w:r>
+              <w:rPr>
+                <w:rFonts w:ascii="BRH Malayalam Extra" w:eastAsia="Times New Roman" w:hAnsi="BRH Malayalam Extra" w:cs="BRH Malayalam Extra"/>
+                <w:color w:val="EE0000"/>
+                <w:sz w:val="32"/>
+                <w:szCs w:val="40"/>
+                <w:lang w:val="it-IT" w:eastAsia="en-IN" w:bidi="ml-IN"/>
+              </w:rPr>
+              <w:t>–</w:t>
+            </w:r>
+            <w:r>
+              <w:rPr>
+                <w:rFonts w:ascii="BRH Malayalam Extra" w:eastAsia="Times New Roman" w:hAnsi="BRH Malayalam Extra" w:cs="BRH Malayalam Extra"/>
+                <w:color w:val="EE0000"/>
+                <w:sz w:val="40"/>
+                <w:szCs w:val="40"/>
+                <w:lang w:val="it-IT" w:eastAsia="en-IN" w:bidi="ml-IN"/>
+              </w:rPr>
+              <w:t>O§K</w:t>
+            </w:r>
+            <w:r>
+              <w:rPr>
+                <w:rFonts w:ascii="BRH Malayalam Extra" w:eastAsia="Times New Roman" w:hAnsi="BRH Malayalam Extra" w:cs="BRH Malayalam Extra"/>
+                <w:color w:val="EE0000"/>
+                <w:sz w:val="32"/>
+                <w:szCs w:val="40"/>
+                <w:lang w:val="it-IT" w:eastAsia="en-IN" w:bidi="ml-IN"/>
+              </w:rPr>
+              <w:t>–</w:t>
+            </w:r>
+            <w:r>
+              <w:rPr>
+                <w:rFonts w:ascii="BRH Malayalam Extra" w:eastAsia="Times New Roman" w:hAnsi="BRH Malayalam Extra" w:cs="BRH Malayalam Extra"/>
+                <w:color w:val="EE0000"/>
+                <w:sz w:val="40"/>
+                <w:szCs w:val="40"/>
+                <w:lang w:val="it-IT" w:eastAsia="en-IN" w:bidi="ml-IN"/>
+              </w:rPr>
+              <w:t xml:space="preserve">PyZ—I PydûzZ | </w:t>
+            </w:r>
+          </w:p>
+          <w:p>
+            <w:pPr>
+              <w:widowControl w:val="0"/>
+              <w:autoSpaceDE w:val="0"/>
+              <w:autoSpaceDN w:val="0"/>
+              <w:adjustRightInd w:val="0"/>
+              <w:spacing w:before="0" w:line="240" w:lineRule="auto"/>
+              <w:rPr>
+                <w:rFonts w:ascii="BRH Malayalam Extra" w:eastAsia="Times New Roman" w:hAnsi="BRH Malayalam Extra" w:cs="BRH Malayalam Extra"/>
+                <w:color w:val="EE0000"/>
+                <w:sz w:val="40"/>
+                <w:szCs w:val="40"/>
+                <w:lang w:val="it-IT" w:eastAsia="en-IN" w:bidi="ml-IN"/>
+              </w:rPr>
+            </w:pPr>
+            <w:r>
+              <w:rPr>
+                <w:rFonts w:ascii="BRH Malayalam Extra" w:eastAsia="Times New Roman" w:hAnsi="BRH Malayalam Extra" w:cs="BRH Malayalam Extra"/>
+                <w:color w:val="EE0000"/>
+                <w:sz w:val="40"/>
+                <w:szCs w:val="40"/>
+                <w:lang w:val="it-IT" w:eastAsia="en-IN" w:bidi="ml-IN"/>
+              </w:rPr>
+              <w:t>K</w:t>
+            </w:r>
+            <w:r>
+              <w:rPr>
+                <w:rFonts w:ascii="BRH Malayalam Extra" w:eastAsia="Times New Roman" w:hAnsi="BRH Malayalam Extra" w:cs="BRH Malayalam Extra"/>
+                <w:color w:val="EE0000"/>
+                <w:sz w:val="32"/>
+                <w:szCs w:val="40"/>
+                <w:lang w:val="it-IT" w:eastAsia="en-IN" w:bidi="ml-IN"/>
+              </w:rPr>
+              <w:t>–</w:t>
+            </w:r>
+            <w:r>
+              <w:rPr>
+                <w:rFonts w:ascii="BRH Malayalam Extra" w:eastAsia="Times New Roman" w:hAnsi="BRH Malayalam Extra" w:cs="BRH Malayalam Extra"/>
+                <w:color w:val="EE0000"/>
+                <w:sz w:val="40"/>
+                <w:szCs w:val="40"/>
+                <w:lang w:val="it-IT" w:eastAsia="en-IN" w:bidi="ml-IN"/>
+              </w:rPr>
+              <w:t>O§K</w:t>
+            </w:r>
+            <w:r>
+              <w:rPr>
+                <w:rFonts w:ascii="BRH Malayalam Extra" w:eastAsia="Times New Roman" w:hAnsi="BRH Malayalam Extra" w:cs="BRH Malayalam Extra"/>
+                <w:color w:val="EE0000"/>
+                <w:sz w:val="32"/>
+                <w:szCs w:val="40"/>
+                <w:lang w:val="it-IT" w:eastAsia="en-IN" w:bidi="ml-IN"/>
+              </w:rPr>
+              <w:t>–</w:t>
+            </w:r>
+            <w:r>
+              <w:rPr>
+                <w:rFonts w:ascii="BRH Malayalam Extra" w:eastAsia="Times New Roman" w:hAnsi="BRH Malayalam Extra" w:cs="BRH Malayalam Extra"/>
+                <w:color w:val="EE0000"/>
+                <w:sz w:val="40"/>
+                <w:szCs w:val="40"/>
+                <w:lang w:val="it-IT" w:eastAsia="en-IN" w:bidi="ml-IN"/>
+              </w:rPr>
+              <w:t>PyZ</w:t>
+            </w:r>
+            <w:r>
+              <w:rPr>
+                <w:rFonts w:ascii="BRH Malayalam Extra" w:eastAsia="Times New Roman" w:hAnsi="BRH Malayalam Extra" w:cs="BRH Malayalam Extra"/>
+                <w:color w:val="EE0000"/>
+                <w:sz w:val="40"/>
+                <w:szCs w:val="40"/>
+                <w:highlight w:val="yellow"/>
+                <w:lang w:val="it-IT" w:eastAsia="en-IN" w:bidi="ml-IN"/>
+              </w:rPr>
+              <w:t>y</w:t>
+            </w:r>
+            <w:r>
+              <w:rPr>
+                <w:rFonts w:ascii="BRH Malayalam Extra" w:eastAsia="Times New Roman" w:hAnsi="BRH Malayalam Extra" w:cs="BRH Malayalam Extra"/>
+                <w:color w:val="EE0000"/>
+                <w:sz w:val="32"/>
+                <w:szCs w:val="40"/>
+                <w:lang w:val="it-IT" w:eastAsia="en-IN" w:bidi="ml-IN"/>
+              </w:rPr>
+              <w:t>–</w:t>
+            </w:r>
+            <w:r>
+              <w:rPr>
+                <w:rFonts w:ascii="BRH Malayalam Extra" w:eastAsia="Times New Roman" w:hAnsi="BRH Malayalam Extra" w:cs="BRH Malayalam Extra"/>
+                <w:color w:val="EE0000"/>
+                <w:sz w:val="40"/>
+                <w:szCs w:val="40"/>
+                <w:lang w:val="it-IT" w:eastAsia="en-IN" w:bidi="ml-IN"/>
+              </w:rPr>
+              <w:t xml:space="preserve">iyZy— </w:t>
+            </w:r>
+          </w:p>
+          <w:p>
+            <w:pPr>
+              <w:widowControl w:val="0"/>
+              <w:autoSpaceDE w:val="0"/>
+              <w:autoSpaceDN w:val="0"/>
+              <w:adjustRightInd w:val="0"/>
+              <w:spacing w:before="0" w:line="240" w:lineRule="auto"/>
+              <w:rPr>
+                <w:rFonts w:ascii="BRH Devanagari Extra" w:hAnsi="BRH Devanagari Extra" w:cs="BRH Devanagari Extra"/>
+                <w:color w:val="EE0000"/>
+                <w:sz w:val="40"/>
+                <w:szCs w:val="40"/>
+                <w:lang w:val="it-IT" w:bidi="ml-IN"/>
+              </w:rPr>
+            </w:pPr>
+            <w:r>
+              <w:rPr>
+                <w:rFonts w:ascii="BRH Malayalam Extra" w:eastAsia="Times New Roman" w:hAnsi="BRH Malayalam Extra" w:cs="BRH Malayalam Extra"/>
+                <w:color w:val="EE0000"/>
+                <w:sz w:val="40"/>
+                <w:szCs w:val="40"/>
+                <w:lang w:val="it-IT" w:eastAsia="en-IN" w:bidi="ml-IN"/>
+              </w:rPr>
+              <w:t>KO§K - PyZ˜I |</w:t>
+            </w:r>
+          </w:p>
+        </w:tc>
+        <w:tc>
+          <w:tcPr>
+            <w:tcW w:w="5388" w:type="dxa"/>
+          </w:tcPr>
+          <w:p>
+            <w:pPr>
+              <w:widowControl w:val="0"/>
+              <w:autoSpaceDE w:val="0"/>
+              <w:autoSpaceDN w:val="0"/>
+              <w:adjustRightInd w:val="0"/>
+              <w:spacing w:before="0" w:line="240" w:lineRule="auto"/>
+              <w:rPr>
+                <w:rFonts w:ascii="BRH Malayalam Extra" w:eastAsia="Times New Roman" w:hAnsi="BRH Malayalam Extra" w:cs="BRH Malayalam Extra"/>
+                <w:color w:val="EE0000"/>
+                <w:sz w:val="40"/>
+                <w:szCs w:val="40"/>
+                <w:lang w:val="it-IT" w:eastAsia="en-IN" w:bidi="ml-IN"/>
+              </w:rPr>
+            </w:pPr>
+            <w:r>
+              <w:rPr>
+                <w:rFonts w:ascii="BRH Malayalam Extra" w:eastAsia="Times New Roman" w:hAnsi="BRH Malayalam Extra" w:cs="BRH Malayalam Extra"/>
+                <w:color w:val="EE0000"/>
+                <w:sz w:val="40"/>
+                <w:szCs w:val="40"/>
+                <w:lang w:val="it-IT" w:eastAsia="en-IN" w:bidi="ml-IN"/>
+              </w:rPr>
+              <w:t>K</w:t>
+            </w:r>
+            <w:r>
+              <w:rPr>
+                <w:rFonts w:ascii="BRH Malayalam Extra" w:eastAsia="Times New Roman" w:hAnsi="BRH Malayalam Extra" w:cs="BRH Malayalam Extra"/>
+                <w:color w:val="EE0000"/>
+                <w:sz w:val="32"/>
+                <w:szCs w:val="40"/>
+                <w:lang w:val="it-IT" w:eastAsia="en-IN" w:bidi="ml-IN"/>
+              </w:rPr>
+              <w:t>–</w:t>
+            </w:r>
+            <w:r>
+              <w:rPr>
+                <w:rFonts w:ascii="BRH Malayalam Extra" w:eastAsia="Times New Roman" w:hAnsi="BRH Malayalam Extra" w:cs="BRH Malayalam Extra"/>
+                <w:color w:val="EE0000"/>
+                <w:sz w:val="40"/>
+                <w:szCs w:val="40"/>
+                <w:lang w:val="it-IT" w:eastAsia="en-IN" w:bidi="ml-IN"/>
+              </w:rPr>
+              <w:t>O§K</w:t>
+            </w:r>
+            <w:r>
+              <w:rPr>
+                <w:rFonts w:ascii="BRH Malayalam Extra" w:eastAsia="Times New Roman" w:hAnsi="BRH Malayalam Extra" w:cs="BRH Malayalam Extra"/>
+                <w:color w:val="EE0000"/>
+                <w:sz w:val="32"/>
+                <w:szCs w:val="40"/>
+                <w:lang w:val="it-IT" w:eastAsia="en-IN" w:bidi="ml-IN"/>
+              </w:rPr>
+              <w:t>–</w:t>
+            </w:r>
+            <w:r>
+              <w:rPr>
+                <w:rFonts w:ascii="BRH Malayalam Extra" w:eastAsia="Times New Roman" w:hAnsi="BRH Malayalam Extra" w:cs="BRH Malayalam Extra"/>
+                <w:color w:val="EE0000"/>
+                <w:sz w:val="40"/>
+                <w:szCs w:val="40"/>
+                <w:lang w:val="it-IT" w:eastAsia="en-IN" w:bidi="ml-IN"/>
+              </w:rPr>
+              <w:t xml:space="preserve">PyZ—I PydûzZ | </w:t>
+            </w:r>
+          </w:p>
+          <w:p>
+            <w:pPr>
+              <w:widowControl w:val="0"/>
+              <w:autoSpaceDE w:val="0"/>
+              <w:autoSpaceDN w:val="0"/>
+              <w:adjustRightInd w:val="0"/>
+              <w:spacing w:before="0" w:line="240" w:lineRule="auto"/>
+              <w:rPr>
+                <w:rFonts w:ascii="BRH Malayalam Extra" w:eastAsia="Times New Roman" w:hAnsi="BRH Malayalam Extra" w:cs="BRH Malayalam Extra"/>
+                <w:color w:val="EE0000"/>
+                <w:sz w:val="40"/>
+                <w:szCs w:val="40"/>
+                <w:lang w:val="it-IT" w:eastAsia="en-IN" w:bidi="ml-IN"/>
+              </w:rPr>
+            </w:pPr>
+            <w:r>
+              <w:rPr>
+                <w:rFonts w:ascii="BRH Malayalam Extra" w:eastAsia="Times New Roman" w:hAnsi="BRH Malayalam Extra" w:cs="BRH Malayalam Extra"/>
+                <w:color w:val="EE0000"/>
+                <w:sz w:val="40"/>
+                <w:szCs w:val="40"/>
+                <w:lang w:val="it-IT" w:eastAsia="en-IN" w:bidi="ml-IN"/>
+              </w:rPr>
+              <w:t>K</w:t>
+            </w:r>
+            <w:r>
+              <w:rPr>
+                <w:rFonts w:ascii="BRH Malayalam Extra" w:eastAsia="Times New Roman" w:hAnsi="BRH Malayalam Extra" w:cs="BRH Malayalam Extra"/>
+                <w:color w:val="EE0000"/>
+                <w:sz w:val="32"/>
+                <w:szCs w:val="40"/>
+                <w:lang w:val="it-IT" w:eastAsia="en-IN" w:bidi="ml-IN"/>
+              </w:rPr>
+              <w:t>–</w:t>
+            </w:r>
+            <w:r>
+              <w:rPr>
+                <w:rFonts w:ascii="BRH Malayalam Extra" w:eastAsia="Times New Roman" w:hAnsi="BRH Malayalam Extra" w:cs="BRH Malayalam Extra"/>
+                <w:color w:val="EE0000"/>
+                <w:sz w:val="40"/>
+                <w:szCs w:val="40"/>
+                <w:lang w:val="it-IT" w:eastAsia="en-IN" w:bidi="ml-IN"/>
+              </w:rPr>
+              <w:t>O§K</w:t>
+            </w:r>
+            <w:r>
+              <w:rPr>
+                <w:rFonts w:ascii="BRH Malayalam Extra" w:eastAsia="Times New Roman" w:hAnsi="BRH Malayalam Extra" w:cs="BRH Malayalam Extra"/>
+                <w:color w:val="EE0000"/>
+                <w:sz w:val="32"/>
+                <w:szCs w:val="40"/>
+                <w:lang w:val="it-IT" w:eastAsia="en-IN" w:bidi="ml-IN"/>
+              </w:rPr>
+              <w:t>–</w:t>
+            </w:r>
+            <w:r>
+              <w:rPr>
+                <w:rFonts w:ascii="BRH Malayalam Extra" w:eastAsia="Times New Roman" w:hAnsi="BRH Malayalam Extra" w:cs="BRH Malayalam Extra"/>
+                <w:color w:val="EE0000"/>
+                <w:sz w:val="40"/>
+                <w:szCs w:val="40"/>
+                <w:lang w:val="it-IT" w:eastAsia="en-IN" w:bidi="ml-IN"/>
+              </w:rPr>
+              <w:t>Py</w:t>
+            </w:r>
+            <w:r>
+              <w:rPr>
+                <w:rFonts w:ascii="BRH Malayalam Extra" w:eastAsia="Times New Roman" w:hAnsi="BRH Malayalam Extra" w:cs="BRH Malayalam Extra"/>
+                <w:color w:val="EE0000"/>
+                <w:sz w:val="40"/>
+                <w:szCs w:val="40"/>
+                <w:highlight w:val="green"/>
+                <w:lang w:val="it-IT" w:eastAsia="en-IN" w:bidi="ml-IN"/>
+              </w:rPr>
+              <w:t>Z</w:t>
+            </w:r>
+            <w:r>
+              <w:rPr>
+                <w:rFonts w:ascii="BRH Malayalam Extra" w:eastAsia="Times New Roman" w:hAnsi="BRH Malayalam Extra" w:cs="BRH Malayalam Extra"/>
+                <w:color w:val="EE0000"/>
+                <w:sz w:val="32"/>
+                <w:szCs w:val="40"/>
+                <w:lang w:val="it-IT" w:eastAsia="en-IN" w:bidi="ml-IN"/>
+              </w:rPr>
+              <w:t>–</w:t>
+            </w:r>
+            <w:r>
+              <w:rPr>
+                <w:rFonts w:ascii="BRH Malayalam Extra" w:eastAsia="Times New Roman" w:hAnsi="BRH Malayalam Extra" w:cs="BRH Malayalam Extra"/>
+                <w:color w:val="EE0000"/>
+                <w:sz w:val="40"/>
+                <w:szCs w:val="40"/>
+                <w:lang w:val="it-IT" w:eastAsia="en-IN" w:bidi="ml-IN"/>
+              </w:rPr>
+              <w:t xml:space="preserve">iyZy— </w:t>
+            </w:r>
+          </w:p>
+          <w:p>
+            <w:pPr>
+              <w:widowControl w:val="0"/>
+              <w:autoSpaceDE w:val="0"/>
+              <w:autoSpaceDN w:val="0"/>
+              <w:adjustRightInd w:val="0"/>
+              <w:spacing w:before="0" w:line="240" w:lineRule="auto"/>
+              <w:rPr>
+                <w:rFonts w:ascii="BRH Devanagari Extra" w:hAnsi="BRH Devanagari Extra" w:cs="BRH Devanagari Extra"/>
+                <w:color w:val="EE0000"/>
+                <w:sz w:val="40"/>
+                <w:szCs w:val="40"/>
+                <w:lang w:val="it-IT" w:bidi="ml-IN"/>
+              </w:rPr>
+            </w:pPr>
+            <w:r>
+              <w:rPr>
+                <w:rFonts w:ascii="BRH Malayalam Extra" w:eastAsia="Times New Roman" w:hAnsi="BRH Malayalam Extra" w:cs="BRH Malayalam Extra"/>
+                <w:color w:val="EE0000"/>
+                <w:sz w:val="40"/>
+                <w:szCs w:val="40"/>
+                <w:lang w:val="it-IT" w:eastAsia="en-IN" w:bidi="ml-IN"/>
+              </w:rPr>
+              <w:t xml:space="preserve">KO§K - PyZ˜I | </w:t>
             </w:r>
           </w:p>
         </w:tc>
@@ -4146,6 +4658,7 @@
           <w:b/>
           <w:bCs/>
         </w:rPr>
+        <w:lastRenderedPageBreak/>
         <w:t>(ignore those which are already incorporated in your book’s version and date)</w:t>
       </w:r>
     </w:p>
@@ -4289,7 +4802,6 @@
                 <w:sz w:val="28"/>
                 <w:szCs w:val="32"/>
               </w:rPr>
-              <w:lastRenderedPageBreak/>
               <w:t>T.S.5.</w:t>
             </w:r>
             <w:r>

</xml_diff>